<commit_message>
Updated resume with latest portfolio link
</commit_message>
<xml_diff>
--- a/DhivyaSelvakumar_Resume.docx
+++ b/DhivyaSelvakumar_Resume.docx
@@ -126,6 +126,8 @@
         </w:rPr>
         <w:t xml:space="preserve">  </w:t>
       </w:r>
+      <w:proofErr w:type="spellStart"/>
+      <w:proofErr w:type="gramStart"/>
       <w:r>
         <w:rPr>
           <w:rFonts w:asciiTheme="minorHAnsi" w:hAnsiTheme="minorHAnsi" w:cstheme="minorHAnsi"/>
@@ -136,7 +138,15 @@
         <w:rPr>
           <w:rFonts w:asciiTheme="minorHAnsi" w:hAnsiTheme="minorHAnsi" w:cstheme="minorHAnsi"/>
         </w:rPr>
-        <w:t xml:space="preserve">,TamilNadu   </w:t>
+        <w:t>,TamilNadu</w:t>
+      </w:r>
+      <w:proofErr w:type="spellEnd"/>
+      <w:proofErr w:type="gramEnd"/>
+      <w:r>
+        <w:rPr>
+          <w:rFonts w:asciiTheme="minorHAnsi" w:hAnsiTheme="minorHAnsi" w:cstheme="minorHAnsi"/>
+        </w:rPr>
+        <w:t xml:space="preserve">   </w:t>
       </w:r>
       <w:r>
         <w:rPr>
@@ -272,6 +282,7 @@
         </w:rPr>
         <w:t>github.com/</w:t>
       </w:r>
+      <w:proofErr w:type="spellStart"/>
       <w:r>
         <w:rPr>
           <w:rStyle w:val="Hyperlink"/>
@@ -308,6 +319,7 @@
         </w:rPr>
         <w:t>kumar</w:t>
       </w:r>
+      <w:proofErr w:type="spellEnd"/>
     </w:p>
     <w:p>
       <w:pPr>
@@ -387,13 +399,26 @@
         </w:rPr>
         <w:t xml:space="preserve"> |  </w:t>
       </w:r>
-      <w:hyperlink r:id="rId8">
+      <w:hyperlink r:id="rId8" w:history="1">
+        <w:proofErr w:type="spellStart"/>
         <w:r>
           <w:rPr>
+            <w:rStyle w:val="Hyperlink"/>
             <w:rFonts w:asciiTheme="minorHAnsi" w:hAnsiTheme="minorHAnsi" w:cstheme="minorHAnsi"/>
-            <w:spacing w:val="-2"/>
+            <w:color w:val="auto"/>
+            <w:u w:val="none"/>
           </w:rPr>
-          <w:t>dhivyaselvam-portfolio.netlify.app/</w:t>
+          <w:t>dhivyaselvakumar.netlify.app</w:t>
+        </w:r>
+        <w:proofErr w:type="spellEnd"/>
+        <w:r>
+          <w:rPr>
+            <w:rStyle w:val="Hyperlink"/>
+            <w:rFonts w:asciiTheme="minorHAnsi" w:hAnsiTheme="minorHAnsi" w:cstheme="minorHAnsi"/>
+            <w:color w:val="auto"/>
+            <w:u w:val="none"/>
+          </w:rPr>
+          <w:t>/</w:t>
         </w:r>
       </w:hyperlink>
     </w:p>
@@ -541,7 +566,23 @@
           <w:rFonts w:asciiTheme="minorHAnsi" w:hAnsiTheme="minorHAnsi" w:cstheme="minorHAnsi"/>
           <w:szCs w:val="22"/>
         </w:rPr>
-        <w:t xml:space="preserve">at Foster DataWorks, driving digital marketing analytics and campaign strategy for </w:t>
+        <w:t xml:space="preserve">at Foster </w:t>
+      </w:r>
+      <w:proofErr w:type="spellStart"/>
+      <w:r>
+        <w:rPr>
+          <w:rFonts w:asciiTheme="minorHAnsi" w:hAnsiTheme="minorHAnsi" w:cstheme="minorHAnsi"/>
+          <w:szCs w:val="22"/>
+        </w:rPr>
+        <w:t>DataWorks</w:t>
+      </w:r>
+      <w:proofErr w:type="spellEnd"/>
+      <w:r>
+        <w:rPr>
+          <w:rFonts w:asciiTheme="minorHAnsi" w:hAnsiTheme="minorHAnsi" w:cstheme="minorHAnsi"/>
+          <w:szCs w:val="22"/>
+        </w:rPr>
+        <w:t xml:space="preserve">, driving digital marketing analytics and campaign strategy for </w:t>
       </w:r>
       <w:r>
         <w:rPr>
@@ -575,6 +616,7 @@
         </w:rPr>
         <w:t xml:space="preserve">, and </w:t>
       </w:r>
+      <w:proofErr w:type="spellStart"/>
       <w:r>
         <w:rPr>
           <w:rFonts w:asciiTheme="minorHAnsi" w:hAnsiTheme="minorHAnsi" w:cstheme="minorHAnsi"/>
@@ -584,6 +626,7 @@
         </w:rPr>
         <w:t>Omnisend</w:t>
       </w:r>
+      <w:proofErr w:type="spellEnd"/>
       <w:r>
         <w:rPr>
           <w:rFonts w:asciiTheme="minorHAnsi" w:hAnsiTheme="minorHAnsi" w:cstheme="minorHAnsi"/>
@@ -902,14 +945,26 @@
           <w:sz w:val="20"/>
         </w:rPr>
       </w:pPr>
+      <w:proofErr w:type="spellStart"/>
       <w:r>
         <w:rPr>
           <w:rFonts w:asciiTheme="minorHAnsi" w:hAnsiTheme="minorHAnsi" w:cstheme="minorHAnsi"/>
           <w:i/>
           <w:sz w:val="20"/>
         </w:rPr>
-        <w:t>K.L.N.College</w:t>
-      </w:r>
+        <w:t>K.L.</w:t>
+      </w:r>
+      <w:proofErr w:type="gramStart"/>
+      <w:r>
+        <w:rPr>
+          <w:rFonts w:asciiTheme="minorHAnsi" w:hAnsiTheme="minorHAnsi" w:cstheme="minorHAnsi"/>
+          <w:i/>
+          <w:sz w:val="20"/>
+        </w:rPr>
+        <w:t>N.College</w:t>
+      </w:r>
+      <w:proofErr w:type="spellEnd"/>
+      <w:proofErr w:type="gramEnd"/>
       <w:r>
         <w:rPr>
           <w:rFonts w:asciiTheme="minorHAnsi" w:hAnsiTheme="minorHAnsi" w:cstheme="minorHAnsi"/>
@@ -970,7 +1025,27 @@
           <w:sz w:val="18"/>
           <w:szCs w:val="18"/>
         </w:rPr>
-        <w:t>| CGPA : 9.0</w:t>
+        <w:t xml:space="preserve">| </w:t>
+      </w:r>
+      <w:proofErr w:type="gramStart"/>
+      <w:r>
+        <w:rPr>
+          <w:rFonts w:asciiTheme="minorHAnsi" w:hAnsiTheme="minorHAnsi" w:cstheme="minorHAnsi"/>
+          <w:spacing w:val="-6"/>
+          <w:sz w:val="18"/>
+          <w:szCs w:val="18"/>
+        </w:rPr>
+        <w:t>CGPA :</w:t>
+      </w:r>
+      <w:proofErr w:type="gramEnd"/>
+      <w:r>
+        <w:rPr>
+          <w:rFonts w:asciiTheme="minorHAnsi" w:hAnsiTheme="minorHAnsi" w:cstheme="minorHAnsi"/>
+          <w:spacing w:val="-6"/>
+          <w:sz w:val="18"/>
+          <w:szCs w:val="18"/>
+        </w:rPr>
+        <w:t xml:space="preserve"> 9.0</w:t>
       </w:r>
       <w:r>
         <w:rPr>
@@ -1488,7 +1563,27 @@
           <w:spacing w:val="-6"/>
           <w:lang w:val="en-IN"/>
         </w:rPr>
-        <w:t>Foster DataWorks Pvt Ltd</w:t>
+        <w:t xml:space="preserve">Foster </w:t>
+      </w:r>
+      <w:proofErr w:type="spellStart"/>
+      <w:r>
+        <w:rPr>
+          <w:rFonts w:asciiTheme="minorHAnsi" w:hAnsiTheme="minorHAnsi" w:cstheme="minorHAnsi"/>
+          <w:color w:val="2E74B5"/>
+          <w:spacing w:val="-6"/>
+          <w:lang w:val="en-IN"/>
+        </w:rPr>
+        <w:t>DataWorks</w:t>
+      </w:r>
+      <w:proofErr w:type="spellEnd"/>
+      <w:r>
+        <w:rPr>
+          <w:rFonts w:asciiTheme="minorHAnsi" w:hAnsiTheme="minorHAnsi" w:cstheme="minorHAnsi"/>
+          <w:color w:val="2E74B5"/>
+          <w:spacing w:val="-6"/>
+          <w:lang w:val="en-IN"/>
+        </w:rPr>
+        <w:t xml:space="preserve"> Pvt Ltd</w:t>
       </w:r>
       <w:r>
         <w:rPr>
@@ -1553,6 +1648,7 @@
         </w:rPr>
         <w:t>(</w:t>
       </w:r>
+      <w:proofErr w:type="spellStart"/>
       <w:r>
         <w:rPr>
           <w:rFonts w:asciiTheme="minorHAnsi" w:hAnsiTheme="minorHAnsi" w:cstheme="minorHAnsi"/>
@@ -1567,6 +1663,7 @@
         </w:rPr>
         <w:t>arsidian</w:t>
       </w:r>
+      <w:proofErr w:type="spellEnd"/>
       <w:r>
         <w:rPr>
           <w:rFonts w:asciiTheme="minorHAnsi" w:hAnsiTheme="minorHAnsi" w:cstheme="minorHAnsi"/>
@@ -1649,13 +1746,23 @@
         </w:rPr>
         <w:t xml:space="preserve">Executed email marketing campaigns using </w:t>
       </w:r>
-      <w:r>
-        <w:rPr>
-          <w:rFonts w:asciiTheme="minorHAnsi" w:hAnsiTheme="minorHAnsi" w:cstheme="minorHAnsi"/>
-          <w:spacing w:val="-6"/>
-          <w:lang w:val="en-IN"/>
-        </w:rPr>
-        <w:t>Omnisend with automation and audience segmentation</w:t>
+      <w:proofErr w:type="spellStart"/>
+      <w:r>
+        <w:rPr>
+          <w:rFonts w:asciiTheme="minorHAnsi" w:hAnsiTheme="minorHAnsi" w:cstheme="minorHAnsi"/>
+          <w:spacing w:val="-6"/>
+          <w:lang w:val="en-IN"/>
+        </w:rPr>
+        <w:t>Omnisend</w:t>
+      </w:r>
+      <w:proofErr w:type="spellEnd"/>
+      <w:r>
+        <w:rPr>
+          <w:rFonts w:asciiTheme="minorHAnsi" w:hAnsiTheme="minorHAnsi" w:cstheme="minorHAnsi"/>
+          <w:spacing w:val="-6"/>
+          <w:lang w:val="en-IN"/>
+        </w:rPr>
+        <w:t xml:space="preserve"> with automation and audience segmentation</w:t>
       </w:r>
     </w:p>
     <w:p>
@@ -1675,6 +1782,7 @@
           <w:lang w:val="en-IN"/>
         </w:rPr>
       </w:pPr>
+      <w:proofErr w:type="spellStart"/>
       <w:r>
         <w:rPr>
           <w:rFonts w:asciiTheme="minorHAnsi" w:hAnsiTheme="minorHAnsi" w:cstheme="minorHAnsi"/>
@@ -1683,7 +1791,18 @@
           <w:spacing w:val="-6"/>
           <w:lang w:val="en-IN"/>
         </w:rPr>
-        <w:t>Analyzed campaign metrics (</w:t>
+        <w:t>Analyzed</w:t>
+      </w:r>
+      <w:proofErr w:type="spellEnd"/>
+      <w:r>
+        <w:rPr>
+          <w:rFonts w:asciiTheme="minorHAnsi" w:hAnsiTheme="minorHAnsi" w:cstheme="minorHAnsi"/>
+          <w:b w:val="0"/>
+          <w:bCs w:val="0"/>
+          <w:spacing w:val="-6"/>
+          <w:lang w:val="en-IN"/>
+        </w:rPr>
+        <w:t xml:space="preserve"> campaign metrics (</w:t>
       </w:r>
       <w:r>
         <w:rPr>
@@ -1911,6 +2030,7 @@
         </w:rPr>
         <w:br/>
       </w:r>
+      <w:proofErr w:type="spellStart"/>
       <w:r>
         <w:rPr>
           <w:rFonts w:asciiTheme="minorHAnsi" w:hAnsiTheme="minorHAnsi" w:cstheme="minorHAnsi"/>
@@ -1918,7 +2038,17 @@
           <w:spacing w:val="-6"/>
           <w:lang w:val="en-IN"/>
         </w:rPr>
-        <w:t>Adishtu Tec Lab, Madurai</w:t>
+        <w:t>Adishtu</w:t>
+      </w:r>
+      <w:proofErr w:type="spellEnd"/>
+      <w:r>
+        <w:rPr>
+          <w:rFonts w:asciiTheme="minorHAnsi" w:hAnsiTheme="minorHAnsi" w:cstheme="minorHAnsi"/>
+          <w:color w:val="2E74B5"/>
+          <w:spacing w:val="-6"/>
+          <w:lang w:val="en-IN"/>
+        </w:rPr>
+        <w:t xml:space="preserve"> Tec Lab, Madurai</w:t>
       </w:r>
       <w:r>
         <w:rPr>
@@ -1966,6 +2096,7 @@
         <w:t xml:space="preserve"> </w:t>
       </w:r>
       <w:hyperlink r:id="rId9" w:history="1">
+        <w:proofErr w:type="spellStart"/>
         <w:r>
           <w:rPr>
             <w:rStyle w:val="Hyperlink"/>
@@ -1976,6 +2107,7 @@
           </w:rPr>
           <w:t>SalesTrackLive</w:t>
         </w:r>
+        <w:proofErr w:type="spellEnd"/>
       </w:hyperlink>
       <w:r>
         <w:rPr>
@@ -1991,7 +2123,27 @@
           <w:bCs w:val="0"/>
           <w:spacing w:val="-6"/>
         </w:rPr>
-        <w:t>— a B2B sales tracking platform — using Next.js for frontend, Supabase for backend, and Canva for design assets, contributing to a successful product launch at</w:t>
+        <w:t xml:space="preserve">— a B2B sales tracking platform — using Next.js for frontend, </w:t>
+      </w:r>
+      <w:proofErr w:type="spellStart"/>
+      <w:r>
+        <w:rPr>
+          <w:rFonts w:asciiTheme="minorHAnsi" w:hAnsiTheme="minorHAnsi" w:cstheme="minorHAnsi"/>
+          <w:b w:val="0"/>
+          <w:bCs w:val="0"/>
+          <w:spacing w:val="-6"/>
+        </w:rPr>
+        <w:t>Supabase</w:t>
+      </w:r>
+      <w:proofErr w:type="spellEnd"/>
+      <w:r>
+        <w:rPr>
+          <w:rFonts w:asciiTheme="minorHAnsi" w:hAnsiTheme="minorHAnsi" w:cstheme="minorHAnsi"/>
+          <w:b w:val="0"/>
+          <w:bCs w:val="0"/>
+          <w:spacing w:val="-6"/>
+        </w:rPr>
+        <w:t xml:space="preserve"> for backend, and Canva for design assets, contributing to a successful product launch at</w:t>
       </w:r>
       <w:r>
         <w:rPr>
@@ -2109,7 +2261,27 @@
           <w:spacing w:val="-6"/>
           <w:lang w:val="en-IN"/>
         </w:rPr>
-        <w:t>Dot Com Infoway Ltd</w:t>
+        <w:t xml:space="preserve">Dot Com </w:t>
+      </w:r>
+      <w:proofErr w:type="spellStart"/>
+      <w:r>
+        <w:rPr>
+          <w:rFonts w:asciiTheme="minorHAnsi" w:hAnsiTheme="minorHAnsi" w:cstheme="minorHAnsi"/>
+          <w:color w:val="2E74B5"/>
+          <w:spacing w:val="-6"/>
+          <w:lang w:val="en-IN"/>
+        </w:rPr>
+        <w:t>Infoway</w:t>
+      </w:r>
+      <w:proofErr w:type="spellEnd"/>
+      <w:r>
+        <w:rPr>
+          <w:rFonts w:asciiTheme="minorHAnsi" w:hAnsiTheme="minorHAnsi" w:cstheme="minorHAnsi"/>
+          <w:color w:val="2E74B5"/>
+          <w:spacing w:val="-6"/>
+          <w:lang w:val="en-IN"/>
+        </w:rPr>
+        <w:t xml:space="preserve"> Ltd</w:t>
       </w:r>
       <w:r>
         <w:rPr>
@@ -2386,21 +2558,40 @@
         </w:rPr>
         <w:br/>
       </w:r>
+      <w:proofErr w:type="spellStart"/>
       <w:r>
         <w:rPr>
           <w:rFonts w:asciiTheme="minorHAnsi" w:hAnsiTheme="minorHAnsi" w:cstheme="minorHAnsi"/>
           <w:spacing w:val="-8"/>
           <w:lang w:val="en-IN"/>
         </w:rPr>
-        <w:t xml:space="preserve">Omnisend • Excel • Google Sheets </w:t>
-      </w:r>
+        <w:t>Omnisend</w:t>
+      </w:r>
+      <w:proofErr w:type="spellEnd"/>
       <w:r>
         <w:rPr>
           <w:rFonts w:asciiTheme="minorHAnsi" w:hAnsiTheme="minorHAnsi" w:cstheme="minorHAnsi"/>
           <w:spacing w:val="-8"/>
-        </w:rPr>
-        <w:t>• Supabase</w:t>
-      </w:r>
+          <w:lang w:val="en-IN"/>
+        </w:rPr>
+        <w:t xml:space="preserve"> • Excel • Google Sheets </w:t>
+      </w:r>
+      <w:r>
+        <w:rPr>
+          <w:rFonts w:asciiTheme="minorHAnsi" w:hAnsiTheme="minorHAnsi" w:cstheme="minorHAnsi"/>
+          <w:spacing w:val="-8"/>
+        </w:rPr>
+        <w:t xml:space="preserve">• </w:t>
+      </w:r>
+      <w:proofErr w:type="spellStart"/>
+      <w:r>
+        <w:rPr>
+          <w:rFonts w:asciiTheme="minorHAnsi" w:hAnsiTheme="minorHAnsi" w:cstheme="minorHAnsi"/>
+          <w:spacing w:val="-8"/>
+        </w:rPr>
+        <w:t>Supabase</w:t>
+      </w:r>
+      <w:proofErr w:type="spellEnd"/>
     </w:p>
     <w:p>
       <w:pPr>
@@ -2738,6 +2929,7 @@
           <w:szCs w:val="14"/>
         </w:rPr>
       </w:pPr>
+      <w:proofErr w:type="spellStart"/>
       <w:r>
         <w:rPr>
           <w:rFonts w:asciiTheme="minorHAnsi" w:hAnsiTheme="minorHAnsi" w:cstheme="minorHAnsi"/>
@@ -2745,7 +2937,17 @@
           <w:spacing w:val="-2"/>
           <w:sz w:val="20"/>
         </w:rPr>
-        <w:t xml:space="preserve">Facevault - </w:t>
+        <w:t>Facevault</w:t>
+      </w:r>
+      <w:proofErr w:type="spellEnd"/>
+      <w:r>
+        <w:rPr>
+          <w:rFonts w:asciiTheme="minorHAnsi" w:hAnsiTheme="minorHAnsi" w:cstheme="minorHAnsi"/>
+          <w:b/>
+          <w:spacing w:val="-2"/>
+          <w:sz w:val="20"/>
+        </w:rPr>
+        <w:t xml:space="preserve"> - </w:t>
       </w:r>
       <w:r>
         <w:rPr>
@@ -2933,7 +3135,31 @@
           <w:sz w:val="14"/>
           <w:szCs w:val="14"/>
         </w:rPr>
-        <w:t>github.com/Dhivyaselvakumar/Face-app</w:t>
+        <w:t>github.com/</w:t>
+      </w:r>
+      <w:proofErr w:type="spellStart"/>
+      <w:r>
+        <w:rPr>
+          <w:rFonts w:asciiTheme="minorHAnsi" w:hAnsiTheme="minorHAnsi" w:cstheme="minorHAnsi"/>
+          <w:b/>
+          <w:bCs/>
+          <w:color w:val="2E74B5"/>
+          <w:sz w:val="14"/>
+          <w:szCs w:val="14"/>
+        </w:rPr>
+        <w:t>Dhivyaselvakumar</w:t>
+      </w:r>
+      <w:proofErr w:type="spellEnd"/>
+      <w:r>
+        <w:rPr>
+          <w:rFonts w:asciiTheme="minorHAnsi" w:hAnsiTheme="minorHAnsi" w:cstheme="minorHAnsi"/>
+          <w:b/>
+          <w:bCs/>
+          <w:color w:val="2E74B5"/>
+          <w:sz w:val="14"/>
+          <w:szCs w:val="14"/>
+        </w:rPr>
+        <w:t>/Face-app</w:t>
       </w:r>
     </w:p>
     <w:p>
@@ -2959,7 +3185,23 @@
           <w:rFonts w:asciiTheme="minorHAnsi" w:hAnsiTheme="minorHAnsi" w:cstheme="minorHAnsi"/>
           <w:sz w:val="20"/>
         </w:rPr>
-        <w:t>Engineered a face recognition login system using face-api.js for biometric authentication and Firebase for real-time database and Google Drive API for file management, enabling passwordless secure cloud storage access.</w:t>
+        <w:t xml:space="preserve">Engineered a face recognition login system using face-api.js for biometric authentication and Firebase for real-time database and Google Drive API for file management, enabling </w:t>
+      </w:r>
+      <w:proofErr w:type="spellStart"/>
+      <w:r>
+        <w:rPr>
+          <w:rFonts w:asciiTheme="minorHAnsi" w:hAnsiTheme="minorHAnsi" w:cstheme="minorHAnsi"/>
+          <w:sz w:val="20"/>
+        </w:rPr>
+        <w:t>passwordless</w:t>
+      </w:r>
+      <w:proofErr w:type="spellEnd"/>
+      <w:r>
+        <w:rPr>
+          <w:rFonts w:asciiTheme="minorHAnsi" w:hAnsiTheme="minorHAnsi" w:cstheme="minorHAnsi"/>
+          <w:sz w:val="20"/>
+        </w:rPr>
+        <w:t xml:space="preserve"> secure cloud storage access.</w:t>
       </w:r>
     </w:p>
     <w:p>
@@ -2985,6 +3227,7 @@
         </w:rPr>
         <w:t xml:space="preserve">  </w:t>
       </w:r>
+      <w:proofErr w:type="spellStart"/>
       <w:r>
         <w:rPr>
           <w:rFonts w:asciiTheme="minorHAnsi" w:hAnsiTheme="minorHAnsi" w:cstheme="minorHAnsi"/>
@@ -2994,7 +3237,19 @@
           <w:sz w:val="20"/>
           <w:szCs w:val="20"/>
         </w:rPr>
-        <w:t xml:space="preserve">EduAdvisor </w:t>
+        <w:t>EduAdvisor</w:t>
+      </w:r>
+      <w:proofErr w:type="spellEnd"/>
+      <w:r>
+        <w:rPr>
+          <w:rFonts w:asciiTheme="minorHAnsi" w:hAnsiTheme="minorHAnsi" w:cstheme="minorHAnsi"/>
+          <w:b/>
+          <w:bCs/>
+          <w:spacing w:val="-2"/>
+          <w:sz w:val="20"/>
+          <w:szCs w:val="20"/>
+        </w:rPr>
+        <w:t xml:space="preserve"> </w:t>
       </w:r>
       <w:r>
         <w:rPr>
@@ -3090,6 +3345,7 @@
         <w:t xml:space="preserve"> </w:t>
       </w:r>
       <w:hyperlink r:id="rId11" w:history="1">
+        <w:proofErr w:type="spellStart"/>
         <w:r>
           <w:rPr>
             <w:rStyle w:val="Hyperlink"/>
@@ -3104,6 +3360,7 @@
           </w:rPr>
           <w:t>eduadvisor.netlify.app</w:t>
         </w:r>
+        <w:proofErr w:type="spellEnd"/>
       </w:hyperlink>
       <w:r>
         <w:rPr>
@@ -3136,8 +3393,45 @@
           <w:sz w:val="14"/>
           <w:szCs w:val="14"/>
         </w:rPr>
-        <w:t>: github.com/Dhivyaselvakumar/EduAdvisor</w:t>
-      </w:r>
+        <w:t>: github.com/</w:t>
+      </w:r>
+      <w:proofErr w:type="spellStart"/>
+      <w:r>
+        <w:rPr>
+          <w:rFonts w:asciiTheme="minorHAnsi" w:hAnsiTheme="minorHAnsi" w:cstheme="minorHAnsi"/>
+          <w:b/>
+          <w:bCs/>
+          <w:color w:val="2E74B5"/>
+          <w:sz w:val="14"/>
+          <w:szCs w:val="14"/>
+        </w:rPr>
+        <w:t>Dhivyaselvakumar</w:t>
+      </w:r>
+      <w:proofErr w:type="spellEnd"/>
+      <w:r>
+        <w:rPr>
+          <w:rFonts w:asciiTheme="minorHAnsi" w:hAnsiTheme="minorHAnsi" w:cstheme="minorHAnsi"/>
+          <w:b/>
+          <w:bCs/>
+          <w:color w:val="2E74B5"/>
+          <w:sz w:val="14"/>
+          <w:szCs w:val="14"/>
+        </w:rPr>
+        <w:t>/</w:t>
+      </w:r>
+      <w:proofErr w:type="spellStart"/>
+      <w:r>
+        <w:rPr>
+          <w:rFonts w:asciiTheme="minorHAnsi" w:hAnsiTheme="minorHAnsi" w:cstheme="minorHAnsi"/>
+          <w:b/>
+          <w:bCs/>
+          <w:color w:val="2E74B5"/>
+          <w:sz w:val="14"/>
+          <w:szCs w:val="14"/>
+        </w:rPr>
+        <w:t>EduAdvisor</w:t>
+      </w:r>
+      <w:proofErr w:type="spellEnd"/>
     </w:p>
     <w:p>
       <w:pPr>
@@ -3180,7 +3474,25 @@
           <w:spacing w:val="-6"/>
           <w:sz w:val="20"/>
         </w:rPr>
-        <w:t xml:space="preserve"> and a trained ML recommendation model that analyses student academic profiles, interests, and scores to suggest personalised career paths for students completing 12th grade</w:t>
+        <w:t xml:space="preserve"> and a trained ML recommendation model that analyses student academic profiles, interests, and scores to suggest </w:t>
+      </w:r>
+      <w:proofErr w:type="spellStart"/>
+      <w:r>
+        <w:rPr>
+          <w:rFonts w:asciiTheme="minorHAnsi" w:hAnsiTheme="minorHAnsi" w:cstheme="minorHAnsi"/>
+          <w:spacing w:val="-6"/>
+          <w:sz w:val="20"/>
+        </w:rPr>
+        <w:t>personalised</w:t>
+      </w:r>
+      <w:proofErr w:type="spellEnd"/>
+      <w:r>
+        <w:rPr>
+          <w:rFonts w:asciiTheme="minorHAnsi" w:hAnsiTheme="minorHAnsi" w:cstheme="minorHAnsi"/>
+          <w:spacing w:val="-6"/>
+          <w:sz w:val="20"/>
+        </w:rPr>
+        <w:t xml:space="preserve"> career paths for students completing 12th grade</w:t>
       </w:r>
       <w:r>
         <w:rPr>
@@ -3295,8 +3607,25 @@
           <w:rFonts w:asciiTheme="minorHAnsi" w:hAnsiTheme="minorHAnsi" w:cstheme="minorHAnsi"/>
           <w:sz w:val="20"/>
         </w:rPr>
-        <w:t xml:space="preserve">Developed a multi-source fraud detection system using NLP and machine learning to analyse job postings, predict fraud probability with a risk score, and surface alerts through a Flask-based web interface — published in </w:t>
-      </w:r>
+        <w:t xml:space="preserve">Developed a multi-source fraud detection system using NLP and machine learning to </w:t>
+      </w:r>
+      <w:proofErr w:type="spellStart"/>
+      <w:r>
+        <w:rPr>
+          <w:rFonts w:asciiTheme="minorHAnsi" w:hAnsiTheme="minorHAnsi" w:cstheme="minorHAnsi"/>
+          <w:sz w:val="20"/>
+        </w:rPr>
+        <w:t>analyse</w:t>
+      </w:r>
+      <w:proofErr w:type="spellEnd"/>
+      <w:r>
+        <w:rPr>
+          <w:rFonts w:asciiTheme="minorHAnsi" w:hAnsiTheme="minorHAnsi" w:cstheme="minorHAnsi"/>
+          <w:sz w:val="20"/>
+        </w:rPr>
+        <w:t xml:space="preserve"> job postings, predict fraud probability with a risk score, and surface alerts through a Flask-based web interface — published in </w:t>
+      </w:r>
+      <w:proofErr w:type="spellStart"/>
       <w:r>
         <w:rPr>
           <w:rFonts w:asciiTheme="minorHAnsi" w:hAnsiTheme="minorHAnsi" w:cstheme="minorHAnsi"/>
@@ -3304,6 +3633,7 @@
         </w:rPr>
         <w:t>Tranz</w:t>
       </w:r>
+      <w:proofErr w:type="spellEnd"/>
       <w:r>
         <w:rPr>
           <w:rFonts w:asciiTheme="minorHAnsi" w:hAnsiTheme="minorHAnsi" w:cstheme="minorHAnsi"/>
@@ -4058,8 +4388,19 @@
           <w:spacing w:val="-2"/>
           <w:sz w:val="20"/>
         </w:rPr>
-        <w:t xml:space="preserve"> and Tranz</w:t>
-      </w:r>
+        <w:t xml:space="preserve"> and </w:t>
+      </w:r>
+      <w:proofErr w:type="spellStart"/>
+      <w:r>
+        <w:rPr>
+          <w:rFonts w:asciiTheme="minorHAnsi" w:hAnsiTheme="minorHAnsi" w:cstheme="minorHAnsi"/>
+          <w:b/>
+          <w:spacing w:val="-2"/>
+          <w:sz w:val="20"/>
+        </w:rPr>
+        <w:t>Tranz</w:t>
+      </w:r>
+      <w:proofErr w:type="spellEnd"/>
     </w:p>
     <w:p>
       <w:pPr>

</xml_diff>

<commit_message>
feat: update resume & portfolio content
- Updated resume in PDF and DOCX formats
- Added msdf.png image asset
- Changed title from 'Business Analyst' to 'Digital Marketing Analyst'
- Updated portfolio bio from 'currently pursuing' to 'Graduated Apr 2026'
</commit_message>
<xml_diff>
--- a/DhivyaSelvakumar_Resume.docx
+++ b/DhivyaSelvakumar_Resume.docx
@@ -67,7 +67,17 @@
           <w:sz w:val="26"/>
           <w:szCs w:val="26"/>
         </w:rPr>
-        <w:t>Business Analyst |Frontend Developer</w:t>
+        <w:t xml:space="preserve">Digital Marketing </w:t>
+      </w:r>
+      <w:r>
+        <w:rPr>
+          <w:rFonts w:asciiTheme="minorHAnsi" w:hAnsiTheme="minorHAnsi" w:cstheme="minorHAnsi"/>
+          <w:color w:val="2E74B5"/>
+          <w:spacing w:val="-12"/>
+          <w:sz w:val="26"/>
+          <w:szCs w:val="26"/>
+        </w:rPr>
+        <w:t>Analyst |Frontend Developer</w:t>
       </w:r>
     </w:p>
     <w:p>
@@ -127,7 +137,6 @@
         <w:t xml:space="preserve">  </w:t>
       </w:r>
       <w:proofErr w:type="spellStart"/>
-      <w:proofErr w:type="gramStart"/>
       <w:r>
         <w:rPr>
           <w:rFonts w:asciiTheme="minorHAnsi" w:hAnsiTheme="minorHAnsi" w:cstheme="minorHAnsi"/>
@@ -141,7 +150,6 @@
         <w:t>,TamilNadu</w:t>
       </w:r>
       <w:proofErr w:type="spellEnd"/>
-      <w:proofErr w:type="gramEnd"/>
       <w:r>
         <w:rPr>
           <w:rFonts w:asciiTheme="minorHAnsi" w:hAnsiTheme="minorHAnsi" w:cstheme="minorHAnsi"/>
@@ -552,7 +560,16 @@
           <w:bCs/>
           <w:szCs w:val="22"/>
         </w:rPr>
-        <w:t>Business Analyst</w:t>
+        <w:t>Digital Marketing</w:t>
+      </w:r>
+      <w:r>
+        <w:rPr>
+          <w:rFonts w:asciiTheme="minorHAnsi" w:hAnsiTheme="minorHAnsi" w:cstheme="minorHAnsi"/>
+          <w:b/>
+          <w:bCs/>
+          <w:szCs w:val="22"/>
+        </w:rPr>
+        <w:t xml:space="preserve"> Analyst</w:t>
       </w:r>
       <w:r>
         <w:rPr>
@@ -952,19 +969,9 @@
           <w:i/>
           <w:sz w:val="20"/>
         </w:rPr>
-        <w:t>K.L.</w:t>
-      </w:r>
-      <w:proofErr w:type="gramStart"/>
-      <w:r>
-        <w:rPr>
-          <w:rFonts w:asciiTheme="minorHAnsi" w:hAnsiTheme="minorHAnsi" w:cstheme="minorHAnsi"/>
-          <w:i/>
-          <w:sz w:val="20"/>
-        </w:rPr>
-        <w:t>N.College</w:t>
+        <w:t>K.L.N.College</w:t>
       </w:r>
       <w:proofErr w:type="spellEnd"/>
-      <w:proofErr w:type="gramEnd"/>
       <w:r>
         <w:rPr>
           <w:rFonts w:asciiTheme="minorHAnsi" w:hAnsiTheme="minorHAnsi" w:cstheme="minorHAnsi"/>
@@ -1025,27 +1032,7 @@
           <w:sz w:val="18"/>
           <w:szCs w:val="18"/>
         </w:rPr>
-        <w:t xml:space="preserve">| </w:t>
-      </w:r>
-      <w:proofErr w:type="gramStart"/>
-      <w:r>
-        <w:rPr>
-          <w:rFonts w:asciiTheme="minorHAnsi" w:hAnsiTheme="minorHAnsi" w:cstheme="minorHAnsi"/>
-          <w:spacing w:val="-6"/>
-          <w:sz w:val="18"/>
-          <w:szCs w:val="18"/>
-        </w:rPr>
-        <w:t>CGPA :</w:t>
-      </w:r>
-      <w:proofErr w:type="gramEnd"/>
-      <w:r>
-        <w:rPr>
-          <w:rFonts w:asciiTheme="minorHAnsi" w:hAnsiTheme="minorHAnsi" w:cstheme="minorHAnsi"/>
-          <w:spacing w:val="-6"/>
-          <w:sz w:val="18"/>
-          <w:szCs w:val="18"/>
-        </w:rPr>
-        <w:t xml:space="preserve"> 9.0</w:t>
+        <w:t>| CGPA : 9.0</w:t>
       </w:r>
       <w:r>
         <w:rPr>
@@ -1472,7 +1459,7 @@
           <w:szCs w:val="22"/>
           <w:lang w:val="en-IN"/>
         </w:rPr>
-        <w:t xml:space="preserve">Business Analyst </w:t>
+        <w:t xml:space="preserve">Digital Marketing </w:t>
       </w:r>
       <w:r>
         <w:rPr>
@@ -1482,7 +1469,17 @@
           <w:szCs w:val="22"/>
           <w:lang w:val="en-IN"/>
         </w:rPr>
-        <w:t xml:space="preserve">                                                                                                                                                             </w:t>
+        <w:t xml:space="preserve">Analyst </w:t>
+      </w:r>
+      <w:r>
+        <w:rPr>
+          <w:rFonts w:asciiTheme="minorHAnsi" w:hAnsiTheme="minorHAnsi" w:cstheme="minorHAnsi"/>
+          <w:spacing w:val="-6"/>
+          <w:sz w:val="22"/>
+          <w:szCs w:val="22"/>
+          <w:lang w:val="en-IN"/>
+        </w:rPr>
+        <w:t xml:space="preserve">                                                                                                                                           </w:t>
       </w:r>
       <w:r>
         <w:rPr>

</xml_diff>